<commit_message>
ERD dan Tabel Transformasi fix
</commit_message>
<xml_diff>
--- a/assets/dokumen/Topik-kelompok-2.docx
+++ b/assets/dokumen/Topik-kelompok-2.docx
@@ -4,6 +4,7 @@
   <w:body>
     <w:p>
       <w:pPr>
+        <w:ind w:left="720" w:firstLine="720"/>
         <w:rPr>
           <w:rFonts w:ascii="Times New Roman" w:hAnsi="Times New Roman" w:cs="Times New Roman"/>
           <w:b/>
@@ -1784,6 +1785,7 @@
           <w:bCs/>
           <w:szCs w:val="24"/>
         </w:rPr>
+        <w:lastRenderedPageBreak/>
         <w:t>armada_</w:t>
       </w:r>
       <w:proofErr w:type="gramStart"/>
@@ -1861,7 +1863,6 @@
           <w:bCs/>
           <w:szCs w:val="24"/>
         </w:rPr>
-        <w:lastRenderedPageBreak/>
         <w:t>departure_</w:t>
       </w:r>
       <w:proofErr w:type="gramStart"/>
@@ -4015,6 +4016,7 @@
           <w:bCs/>
           <w:szCs w:val="24"/>
         </w:rPr>
+        <w:lastRenderedPageBreak/>
         <w:t xml:space="preserve">2. routes </w:t>
       </w:r>
       <w:proofErr w:type="spellStart"/>
@@ -4056,7 +4058,6 @@
           <w:bCs/>
           <w:szCs w:val="24"/>
         </w:rPr>
-        <w:lastRenderedPageBreak/>
         <w:t>Logika:</w:t>
       </w:r>
       <w:r>
@@ -9202,6 +9203,7 @@
   <w:style w:type="character" w:default="1" w:styleId="DefaultParagraphFont">
     <w:name w:val="Default Paragraph Font"/>
     <w:uiPriority w:val="1"/>
+    <w:semiHidden/>
     <w:unhideWhenUsed/>
   </w:style>
   <w:style w:type="table" w:default="1" w:styleId="TableNormal">

</xml_diff>